<commit_message>
Enrich Girish Kaushik section with profile URL and direct-message strategy
- Add LinkedIn URL: linkedin.com/in/girish-kaushik-4ab3b716
- Note that Message button on his profile = Open Profile enabled
- Add 835-char Direct Message variant as the recommended path
- Keeps connection note + InMail variants as fallbacks
</commit_message>
<xml_diff>
--- a/outreach/Philips_PSO_Outreach_Pack.docx
+++ b/outreach/Philips_PSO_Outreach_Pack.docx
@@ -370,6 +370,92 @@
       </w:r>
       <w:r>
         <w:t>Head of Program Management at Philips</w:t>
+      </w:r>
+    </w:p>
+    <w:p>
+      <w:r>
+        <w:rPr>
+          <w:b/>
+        </w:rPr>
+        <w:t xml:space="preserve">LinkedIn URL: </w:t>
+      </w:r>
+      <w:r>
+        <w:t>https://linkedin.com/in/girish-kaushik-4ab3b716/</w:t>
+      </w:r>
+    </w:p>
+    <w:p>
+      <w:r>
+        <w:rPr>
+          <w:b/>
+        </w:rPr>
+        <w:t xml:space="preserve">Connection status: </w:t>
+      </w:r>
+      <w:r>
+        <w:t>3rd+ degree, but profile shows "Message" button → Open Profile is enabled → you can DM him directly without sending a connection request.</w:t>
+      </w:r>
+    </w:p>
+    <w:p>
+      <w:r>
+        <w:rPr>
+          <w:b/>
+          <w:i w:val="0"/>
+          <w:color w:val="C0504D"/>
+        </w:rPr>
+        <w:t>Recommended path (NEW — based on his profile signals)</w:t>
+      </w:r>
+    </w:p>
+    <w:p>
+      <w:pPr>
+        <w:shd w:val="clear" w:color="auto" w:fill="FFF3CC"/>
+      </w:pPr>
+      <w:r>
+        <w:rPr>
+          <w:b w:val="0"/>
+          <w:i/>
+        </w:rPr>
+        <w:t>Skip the connection request entirely. Use the 'Direct Message' variant below — it goes straight to his inbox via LinkedIn's free direct-message channel (no InMail credit consumed). This is the fastest, highest-trust path because there's no pending request hanging in his queue. If 'Message' is greyed out for any reason on the day you try, fall back to the 300-char connection note further down.</w:t>
+      </w:r>
+    </w:p>
+    <w:p>
+      <w:r>
+        <w:rPr>
+          <w:b/>
+          <w:i w:val="0"/>
+          <w:color w:val="1F497D"/>
+        </w:rPr>
+        <w:t>Direct Message (recommended; ~835 chars)</w:t>
+      </w:r>
+    </w:p>
+    <w:p>
+      <w:pPr>
+        <w:ind w:left="288" w:right="288"/>
+        <w:shd w:val="clear" w:color="auto" w:fill="F2F2F2"/>
+      </w:pPr>
+      <w:r>
+        <w:rPr>
+          <w:b w:val="0"/>
+          <w:i w:val="0"/>
+          <w:sz w:val="21"/>
+        </w:rPr>
+        <w:t>Hi Girish,</w:t>
+        <w:br/>
+        <w:br/>
+        <w:t>I'm exploring the Project Support Office (PSO) Analyst role within Philips' Program Management function and reaching out directly given you lead the org.</w:t>
+        <w:br/>
+        <w:br/>
+        <w:t>Quick context: 4+ years at Deloitte (USI) running PMO governance for global tax compliance and transformation programs across 10+ UK and European clients. Built the RAG/RAID, financial-tracking, and SharePoint + Power BI machinery that delivered 100% on-time filings, cut reporting effort 25%, and contributed to 4 RFP wins. MBA Finance + CA Inter, PMP in progress (H2 2026), immediate joiner.</w:t>
+        <w:br/>
+        <w:br/>
+        <w:t>Not asking for a referral — just 5 minutes of your perspective on what differentiates strong PSO talent at Philips and where the function is heading. Happy to share my CV if useful.</w:t>
+        <w:br/>
+        <w:br/>
+        <w:t>Thanks for your time,</w:t>
+        <w:br/>
+        <w:t>Srikanth Chintala</w:t>
+        <w:br/>
+        <w:t>+91 81795 98723</w:t>
+        <w:br/>
+        <w:t>linkedin.com/in/chintalasrikanth97</w:t>
       </w:r>
     </w:p>
     <w:p>

</xml_diff>